<commit_message>
fix(medic8): move AI incident playbooks into numbered runbook hierarchy (2.8-2.10)
Co-Authored-By: Claude Sonnet 4.6 <noreply@anthropic.com>
</commit_message>
<xml_diff>
--- a/projects/Medic8/06-deployment-operations/Medic8_Runbook.docx
+++ b/projects/Medic8/06-deployment-operations/Medic8_Runbook.docx
@@ -28,7 +28,7 @@
         </w:p>
       </w:sdtContent>
     </w:sdt>
-    <w:bookmarkStart w:id="60" w:name="X79f63530afa0e704ea7459ecb9a20a8b440c545"/>
+    <w:bookmarkStart w:id="59" w:name="X79f63530afa0e704ea7459ecb9a20a8b440c545"/>
     <w:p>
       <w:pPr>
         <w:pStyle w:val="Heading1"/>
@@ -1352,7 +1352,7 @@
     </w:p>
     <w:bookmarkEnd w:id="21"/>
     <w:bookmarkEnd w:id="22"/>
-    <w:bookmarkStart w:id="31" w:name="Xfd08cf0b1df95df4f35988d0599d2d6512686c5"/>
+    <w:bookmarkStart w:id="34" w:name="Xfd08cf0b1df95df4f35988d0599d2d6512686c5"/>
     <w:p>
       <w:pPr>
         <w:pStyle w:val="Heading2"/>
@@ -6636,23 +6636,13 @@
       </w:r>
     </w:p>
     <w:bookmarkEnd w:id="30"/>
-    <w:bookmarkEnd w:id="31"/>
-    <w:bookmarkStart w:id="35" w:name="ai-intelligence-incidents"/>
-    <w:p>
-      <w:pPr>
-        <w:pStyle w:val="Heading2"/>
-      </w:pPr>
-      <w:r>
-        <w:t xml:space="preserve">AI Intelligence Incidents</w:t>
-      </w:r>
-    </w:p>
-    <w:bookmarkStart w:id="32" w:name="ai-provider-outage"/>
+    <w:bookmarkStart w:id="31" w:name="X383ec92c725814ae17c28eff026aecc3ab27c39"/>
     <w:p>
       <w:pPr>
         <w:pStyle w:val="Heading3"/>
       </w:pPr>
       <w:r>
-        <w:t xml:space="preserve">AI Provider Outage</w:t>
+        <w:t xml:space="preserve">2.8 AI Provider Outage</w:t>
       </w:r>
     </w:p>
     <w:p>
@@ -6801,14 +6791,14 @@
         </w:pict>
       </w:r>
     </w:p>
-    <w:bookmarkEnd w:id="32"/>
-    <w:bookmarkStart w:id="33" w:name="ai-credit-exhaustion"/>
+    <w:bookmarkEnd w:id="31"/>
+    <w:bookmarkStart w:id="32" w:name="X285217e8548f85ea8eb2b64f4082e22ee525a01"/>
     <w:p>
       <w:pPr>
         <w:pStyle w:val="Heading3"/>
       </w:pPr>
       <w:r>
-        <w:t xml:space="preserve">AI Credit Exhaustion</w:t>
+        <w:t xml:space="preserve">2.9 AI Credit Exhaustion</w:t>
       </w:r>
     </w:p>
     <w:p>
@@ -6942,14 +6932,14 @@
         </w:pict>
       </w:r>
     </w:p>
-    <w:bookmarkEnd w:id="33"/>
-    <w:bookmarkStart w:id="34" w:name="Xe894c74bd81b3bd68f744e59ec8a0d8246f733d"/>
+    <w:bookmarkEnd w:id="32"/>
+    <w:bookmarkStart w:id="33" w:name="Xb9c0ba5ee3ed054539b993bd5b78c5b4601c1b7"/>
     <w:p>
       <w:pPr>
         <w:pStyle w:val="Heading3"/>
       </w:pPr>
       <w:r>
-        <w:t xml:space="preserve">UI Rendering English in Non-English Locale</w:t>
+        <w:t xml:space="preserve">2.10 UI Rendering English in Non-English Locale</w:t>
       </w:r>
     </w:p>
     <w:p>
@@ -7122,9 +7112,9 @@
         </w:pict>
       </w:r>
     </w:p>
+    <w:bookmarkEnd w:id="33"/>
     <w:bookmarkEnd w:id="34"/>
-    <w:bookmarkEnd w:id="35"/>
-    <w:bookmarkStart w:id="55" w:name="X893b09bb7baf385a9939dd7639da58c8f4c84c6"/>
+    <w:bookmarkStart w:id="54" w:name="X893b09bb7baf385a9939dd7639da58c8f4c84c6"/>
     <w:p>
       <w:pPr>
         <w:pStyle w:val="Heading2"/>
@@ -7133,7 +7123,7 @@
         <w:t xml:space="preserve">3. Maintenance Procedures</w:t>
       </w:r>
     </w:p>
-    <w:bookmarkStart w:id="39" w:name="X477da35d0b3384f9d9a33fdd741adeb2928ccc4"/>
+    <w:bookmarkStart w:id="38" w:name="X477da35d0b3384f9d9a33fdd741adeb2928ccc4"/>
     <w:p>
       <w:pPr>
         <w:pStyle w:val="Heading3"/>
@@ -7142,7 +7132,7 @@
         <w:t xml:space="preserve">3.1 Database Maintenance</w:t>
       </w:r>
     </w:p>
-    <w:bookmarkStart w:id="36" w:name="X92dcbe03268f92cfde6f0ca78b86483e2ef74ba"/>
+    <w:bookmarkStart w:id="35" w:name="X92dcbe03268f92cfde6f0ca78b86483e2ef74ba"/>
     <w:p>
       <w:pPr>
         <w:pStyle w:val="Heading4"/>
@@ -7461,8 +7451,8 @@
         <w:t xml:space="preserve">rebuilds the table and all indexes in-place (InnoDB online DDL). This is non-blocking for reads but may briefly block writes on very large tables.</w:t>
       </w:r>
     </w:p>
-    <w:bookmarkEnd w:id="36"/>
-    <w:bookmarkStart w:id="37" w:name="Xb95863d8f2a2e1ec12c99867177653e71fe288e"/>
+    <w:bookmarkEnd w:id="35"/>
+    <w:bookmarkStart w:id="36" w:name="Xb95863d8f2a2e1ec12c99867177653e71fe288e"/>
     <w:p>
       <w:pPr>
         <w:pStyle w:val="Heading4"/>
@@ -7690,8 +7680,8 @@
         <w:t xml:space="preserve"> lab_results;</w:t>
       </w:r>
     </w:p>
-    <w:bookmarkEnd w:id="37"/>
-    <w:bookmarkStart w:id="38" w:name="X55c62c635097757352bcb1e6445f61727c04db3"/>
+    <w:bookmarkEnd w:id="36"/>
+    <w:bookmarkStart w:id="37" w:name="X55c62c635097757352bcb1e6445f61727c04db3"/>
     <w:p>
       <w:pPr>
         <w:pStyle w:val="Heading4"/>
@@ -8005,9 +7995,9 @@
         </w:pict>
       </w:r>
     </w:p>
+    <w:bookmarkEnd w:id="37"/>
     <w:bookmarkEnd w:id="38"/>
-    <w:bookmarkEnd w:id="39"/>
-    <w:bookmarkStart w:id="43" w:name="Xde4f9b1be1bbc04e14579c90dd896b5df7c5165"/>
+    <w:bookmarkStart w:id="42" w:name="Xde4f9b1be1bbc04e14579c90dd896b5df7c5165"/>
     <w:p>
       <w:pPr>
         <w:pStyle w:val="Heading3"/>
@@ -8016,7 +8006,7 @@
         <w:t xml:space="preserve">3.2 Application Updates</w:t>
       </w:r>
     </w:p>
-    <w:bookmarkStart w:id="40" w:name="X5d33ac1ffeba3591f2db3488d2b03be456ca6c9"/>
+    <w:bookmarkStart w:id="39" w:name="X5d33ac1ffeba3591f2db3488d2b03be456ca6c9"/>
     <w:p>
       <w:pPr>
         <w:pStyle w:val="Heading4"/>
@@ -8099,8 +8089,8 @@
         <w:t xml:space="preserve">60 seconds</w:t>
       </w:r>
     </w:p>
-    <w:bookmarkEnd w:id="40"/>
-    <w:bookmarkStart w:id="41" w:name="Xabe41a154c168c3431b95ecef52af4ea416b868"/>
+    <w:bookmarkEnd w:id="39"/>
+    <w:bookmarkStart w:id="40" w:name="Xabe41a154c168c3431b95ecef52af4ea416b868"/>
     <w:p>
       <w:pPr>
         <w:pStyle w:val="Heading4"/>
@@ -8210,8 +8200,8 @@
         <w:t xml:space="preserve">If unstable, switch the ALB listener back to the blue service.</w:t>
       </w:r>
     </w:p>
-    <w:bookmarkEnd w:id="41"/>
-    <w:bookmarkStart w:id="42" w:name="X81a63d4ce0f1efbe758959d259e52a74b1e1ef4"/>
+    <w:bookmarkEnd w:id="40"/>
+    <w:bookmarkStart w:id="41" w:name="X81a63d4ce0f1efbe758959d259e52a74b1e1ef4"/>
     <w:p>
       <w:pPr>
         <w:pStyle w:val="Heading4"/>
@@ -8293,48 +8283,48 @@
         </w:pict>
       </w:r>
     </w:p>
+    <w:bookmarkEnd w:id="41"/>
     <w:bookmarkEnd w:id="42"/>
+    <w:bookmarkStart w:id="46" w:name="X7a6dfa5c8dc82d30aa0346e5c5dceaa0c87c38b"/>
+    <w:p>
+      <w:pPr>
+        <w:pStyle w:val="Heading3"/>
+      </w:pPr>
+      <w:r>
+        <w:t xml:space="preserve">3.3 Drug Formulary Updates</w:t>
+      </w:r>
+    </w:p>
+    <w:bookmarkStart w:id="43" w:name="Xc1aa8c285d612cff602d543ed76aed99e7ee748"/>
+    <w:p>
+      <w:pPr>
+        <w:pStyle w:val="Heading4"/>
+      </w:pPr>
+      <w:r>
+        <w:t xml:space="preserve">3.3.1 Trigger</w:t>
+      </w:r>
+    </w:p>
+    <w:p>
+      <w:pPr>
+        <w:pStyle w:val="FirstParagraph"/>
+      </w:pPr>
+      <w:r>
+        <w:t xml:space="preserve">The drug formulary is updated when the National Drug Authority (NDA) Uganda, Pharmacy and Poisons Board (PPB) Kenya, CDSCO India, or TGA Australia publishes changes. Monitor NDA notices at</w:t>
+      </w:r>
+      <w:r>
+        <w:t xml:space="preserve"> </w:t>
+      </w:r>
+      <w:r>
+        <w:rPr>
+          <w:rStyle w:val="VerbatimChar"/>
+        </w:rPr>
+        <w:t xml:space="preserve">https://www.nda.or.ug</w:t>
+      </w:r>
+      <w:r>
+        <w:t xml:space="preserve">.</w:t>
+      </w:r>
+    </w:p>
     <w:bookmarkEnd w:id="43"/>
-    <w:bookmarkStart w:id="47" w:name="X7a6dfa5c8dc82d30aa0346e5c5dceaa0c87c38b"/>
-    <w:p>
-      <w:pPr>
-        <w:pStyle w:val="Heading3"/>
-      </w:pPr>
-      <w:r>
-        <w:t xml:space="preserve">3.3 Drug Formulary Updates</w:t>
-      </w:r>
-    </w:p>
-    <w:bookmarkStart w:id="44" w:name="Xc1aa8c285d612cff602d543ed76aed99e7ee748"/>
-    <w:p>
-      <w:pPr>
-        <w:pStyle w:val="Heading4"/>
-      </w:pPr>
-      <w:r>
-        <w:t xml:space="preserve">3.3.1 Trigger</w:t>
-      </w:r>
-    </w:p>
-    <w:p>
-      <w:pPr>
-        <w:pStyle w:val="FirstParagraph"/>
-      </w:pPr>
-      <w:r>
-        <w:t xml:space="preserve">The drug formulary is updated when the National Drug Authority (NDA) Uganda, Pharmacy and Poisons Board (PPB) Kenya, CDSCO India, or TGA Australia publishes changes. Monitor NDA notices at</w:t>
-      </w:r>
-      <w:r>
-        <w:t xml:space="preserve"> </w:t>
-      </w:r>
-      <w:r>
-        <w:rPr>
-          <w:rStyle w:val="VerbatimChar"/>
-        </w:rPr>
-        <w:t xml:space="preserve">https://www.nda.or.ug</w:t>
-      </w:r>
-      <w:r>
-        <w:t xml:space="preserve">.</w:t>
-      </w:r>
-    </w:p>
-    <w:bookmarkEnd w:id="44"/>
-    <w:bookmarkStart w:id="45" w:name="X50570e2a4fd4aacdda77a654d88bdad3b046a64"/>
+    <w:bookmarkStart w:id="44" w:name="X50570e2a4fd4aacdda77a654d88bdad3b046a64"/>
     <w:p>
       <w:pPr>
         <w:pStyle w:val="Heading4"/>
@@ -8595,8 +8585,8 @@
         <w:t xml:space="preserve">Log the change in the formulary version history table.</w:t>
       </w:r>
     </w:p>
-    <w:bookmarkEnd w:id="45"/>
-    <w:bookmarkStart w:id="46" w:name="X623c515d32aa934f42ad044eb905337980345bf"/>
+    <w:bookmarkEnd w:id="44"/>
+    <w:bookmarkStart w:id="45" w:name="X623c515d32aa934f42ad044eb905337980345bf"/>
     <w:p>
       <w:pPr>
         <w:pStyle w:val="Heading4"/>
@@ -8620,51 +8610,51 @@
         </w:pict>
       </w:r>
     </w:p>
+    <w:bookmarkEnd w:id="45"/>
     <w:bookmarkEnd w:id="46"/>
+    <w:bookmarkStart w:id="50" w:name="X0e2ae45f1a0179ba29f863423a50e2e14bbaf5f"/>
+    <w:p>
+      <w:pPr>
+        <w:pStyle w:val="Heading3"/>
+      </w:pPr>
+      <w:r>
+        <w:t xml:space="preserve">3.4 HMIS Form Updates</w:t>
+      </w:r>
+    </w:p>
+    <w:bookmarkStart w:id="47" w:name="X0f4a040cb73cd192d2a5bc016e069f75cd8bfa6"/>
+    <w:p>
+      <w:pPr>
+        <w:pStyle w:val="Heading4"/>
+      </w:pPr>
+      <w:r>
+        <w:t xml:space="preserve">3.4.1 Trigger</w:t>
+      </w:r>
+    </w:p>
+    <w:p>
+      <w:pPr>
+        <w:pStyle w:val="FirstParagraph"/>
+      </w:pPr>
+      <w:r>
+        <w:t xml:space="preserve">The Uganda Ministry of Health publishes updated HMIS form definitions. Monitor</w:t>
+      </w:r>
+      <w:r>
+        <w:t xml:space="preserve"> </w:t>
+      </w:r>
+      <w:r>
+        <w:rPr>
+          <w:rStyle w:val="VerbatimChar"/>
+        </w:rPr>
+        <w:t xml:space="preserve">hmis2.health.go.ug</w:t>
+      </w:r>
+      <w:r>
+        <w:t xml:space="preserve"> </w:t>
+      </w:r>
+      <w:r>
+        <w:t xml:space="preserve">and MoH circular notices. Target turnaround: 30 days from MoH publication to production deployment.</w:t>
+      </w:r>
+    </w:p>
     <w:bookmarkEnd w:id="47"/>
-    <w:bookmarkStart w:id="51" w:name="X0e2ae45f1a0179ba29f863423a50e2e14bbaf5f"/>
-    <w:p>
-      <w:pPr>
-        <w:pStyle w:val="Heading3"/>
-      </w:pPr>
-      <w:r>
-        <w:t xml:space="preserve">3.4 HMIS Form Updates</w:t>
-      </w:r>
-    </w:p>
-    <w:bookmarkStart w:id="48" w:name="X0f4a040cb73cd192d2a5bc016e069f75cd8bfa6"/>
-    <w:p>
-      <w:pPr>
-        <w:pStyle w:val="Heading4"/>
-      </w:pPr>
-      <w:r>
-        <w:t xml:space="preserve">3.4.1 Trigger</w:t>
-      </w:r>
-    </w:p>
-    <w:p>
-      <w:pPr>
-        <w:pStyle w:val="FirstParagraph"/>
-      </w:pPr>
-      <w:r>
-        <w:t xml:space="preserve">The Uganda Ministry of Health publishes updated HMIS form definitions. Monitor</w:t>
-      </w:r>
-      <w:r>
-        <w:t xml:space="preserve"> </w:t>
-      </w:r>
-      <w:r>
-        <w:rPr>
-          <w:rStyle w:val="VerbatimChar"/>
-        </w:rPr>
-        <w:t xml:space="preserve">hmis2.health.go.ug</w:t>
-      </w:r>
-      <w:r>
-        <w:t xml:space="preserve"> </w:t>
-      </w:r>
-      <w:r>
-        <w:t xml:space="preserve">and MoH circular notices. Target turnaround: 30 days from MoH publication to production deployment.</w:t>
-      </w:r>
-    </w:p>
-    <w:bookmarkEnd w:id="48"/>
-    <w:bookmarkStart w:id="49" w:name="Xd83284f1e1906e0db8e9e138f0dbdf2d0fcdd49"/>
+    <w:bookmarkStart w:id="48" w:name="Xd83284f1e1906e0db8e9e138f0dbdf2d0fcdd49"/>
     <w:p>
       <w:pPr>
         <w:pStyle w:val="Heading4"/>
@@ -8973,8 +8963,8 @@
         <w:t xml:space="preserve">Notify all affected facilities.</w:t>
       </w:r>
     </w:p>
-    <w:bookmarkEnd w:id="49"/>
-    <w:bookmarkStart w:id="50" w:name="X145f87c41fadc9d1772897c54eddc97a83bcb28"/>
+    <w:bookmarkEnd w:id="48"/>
+    <w:bookmarkStart w:id="49" w:name="X145f87c41fadc9d1772897c54eddc97a83bcb28"/>
     <w:p>
       <w:pPr>
         <w:pStyle w:val="Heading4"/>
@@ -9010,9 +9000,9 @@
         </w:pict>
       </w:r>
     </w:p>
+    <w:bookmarkEnd w:id="49"/>
     <w:bookmarkEnd w:id="50"/>
-    <w:bookmarkEnd w:id="51"/>
-    <w:bookmarkStart w:id="54" w:name="X352e641f631c597aabe15899356dcfd8ea82a51"/>
+    <w:bookmarkStart w:id="53" w:name="X352e641f631c597aabe15899356dcfd8ea82a51"/>
     <w:p>
       <w:pPr>
         <w:pStyle w:val="Heading3"/>
@@ -9021,7 +9011,7 @@
         <w:t xml:space="preserve">3.5 SSL Certificate Renewal</w:t>
       </w:r>
     </w:p>
-    <w:bookmarkStart w:id="52" w:name="X057e48439da4faf873fa0b9a735612825f04238"/>
+    <w:bookmarkStart w:id="51" w:name="X057e48439da4faf873fa0b9a735612825f04238"/>
     <w:p>
       <w:pPr>
         <w:pStyle w:val="Heading4"/>
@@ -9068,8 +9058,8 @@
         <w:t xml:space="preserve">, the DNS validation record may have been deleted. Re-create the CNAME record in Route 53.</w:t>
       </w:r>
     </w:p>
-    <w:bookmarkEnd w:id="52"/>
-    <w:bookmarkStart w:id="53" w:name="Xefad9dbd9b8069e77902d06409c63e392333be0"/>
+    <w:bookmarkEnd w:id="51"/>
+    <w:bookmarkStart w:id="52" w:name="Xefad9dbd9b8069e77902d06409c63e392333be0"/>
     <w:p>
       <w:pPr>
         <w:pStyle w:val="Heading4"/>
@@ -9189,10 +9179,10 @@
         </w:pict>
       </w:r>
     </w:p>
+    <w:bookmarkEnd w:id="52"/>
     <w:bookmarkEnd w:id="53"/>
     <w:bookmarkEnd w:id="54"/>
-    <w:bookmarkEnd w:id="55"/>
-    <w:bookmarkStart w:id="58" w:name="Xfb2be1609d5a4f0bc61d26926242f5c14abdf35"/>
+    <w:bookmarkStart w:id="57" w:name="Xfb2be1609d5a4f0bc61d26926242f5c14abdf35"/>
     <w:p>
       <w:pPr>
         <w:pStyle w:val="Heading2"/>
@@ -9475,7 +9465,7 @@
             <w:pPr>
               <w:pStyle w:val="Compact"/>
             </w:pPr>
-            <w:hyperlink r:id="rId56">
+            <w:hyperlink r:id="rId55">
               <w:r>
                 <w:rPr>
                   <w:rStyle w:val="Hyperlink"/>
@@ -9636,7 +9626,7 @@
         </w:tc>
       </w:tr>
     </w:tbl>
-    <w:bookmarkStart w:id="57" w:name="Xd638071336cb2b557bb7929aa626463483c2fad"/>
+    <w:bookmarkStart w:id="56" w:name="Xd638071336cb2b557bb7929aa626463483c2fad"/>
     <w:p>
       <w:pPr>
         <w:pStyle w:val="Heading3"/>
@@ -10036,254 +10026,254 @@
         </w:pict>
       </w:r>
     </w:p>
+    <w:bookmarkEnd w:id="56"/>
     <w:bookmarkEnd w:id="57"/>
+    <w:bookmarkStart w:id="58" w:name="X13c0f92f9fc6056cb69829926e41a1073b3d5d4"/>
+    <w:p>
+      <w:pPr>
+        <w:pStyle w:val="Heading2"/>
+      </w:pPr>
+      <w:r>
+        <w:t xml:space="preserve">5. Post-Incident Review Template</w:t>
+      </w:r>
+    </w:p>
+    <w:p>
+      <w:pPr>
+        <w:pStyle w:val="FirstParagraph"/>
+      </w:pPr>
+      <w:r>
+        <w:t xml:space="preserve">Complete this template within 48 hours of resolving any Critical incident.</w:t>
+      </w:r>
+    </w:p>
+    <w:p>
+      <w:pPr>
+        <w:pStyle w:val="SourceCode"/>
+      </w:pPr>
+      <w:r>
+        <w:rPr>
+          <w:rStyle w:val="VerbatimChar"/>
+        </w:rPr>
+        <w:t xml:space="preserve">## Post-Incident Review</w:t>
+      </w:r>
+      <w:r>
+        <w:br/>
+      </w:r>
+      <w:r>
+        <w:br/>
+      </w:r>
+      <w:r>
+        <w:rPr>
+          <w:rStyle w:val="VerbatimChar"/>
+        </w:rPr>
+        <w:t xml:space="preserve">**Incident ID:** INC-YYYY-NNN</w:t>
+      </w:r>
+      <w:r>
+        <w:br/>
+      </w:r>
+      <w:r>
+        <w:rPr>
+          <w:rStyle w:val="VerbatimChar"/>
+        </w:rPr>
+        <w:t xml:space="preserve">**Date/Time Detected:** YYYY-MM-DD HH:MM EAT</w:t>
+      </w:r>
+      <w:r>
+        <w:br/>
+      </w:r>
+      <w:r>
+        <w:rPr>
+          <w:rStyle w:val="VerbatimChar"/>
+        </w:rPr>
+        <w:t xml:space="preserve">**Date/Time Resolved:** YYYY-MM-DD HH:MM EAT</w:t>
+      </w:r>
+      <w:r>
+        <w:br/>
+      </w:r>
+      <w:r>
+        <w:rPr>
+          <w:rStyle w:val="VerbatimChar"/>
+        </w:rPr>
+        <w:t xml:space="preserve">**Duration:** X hours Y minutes</w:t>
+      </w:r>
+      <w:r>
+        <w:br/>
+      </w:r>
+      <w:r>
+        <w:rPr>
+          <w:rStyle w:val="VerbatimChar"/>
+        </w:rPr>
+        <w:t xml:space="preserve">**Severity:** Critical / Warning</w:t>
+      </w:r>
+      <w:r>
+        <w:br/>
+      </w:r>
+      <w:r>
+        <w:rPr>
+          <w:rStyle w:val="VerbatimChar"/>
+        </w:rPr>
+        <w:t xml:space="preserve">**Affected Facilities:** [list]</w:t>
+      </w:r>
+      <w:r>
+        <w:br/>
+      </w:r>
+      <w:r>
+        <w:rPr>
+          <w:rStyle w:val="VerbatimChar"/>
+        </w:rPr>
+        <w:t xml:space="preserve">**Affected Patients:** [count, if applicable]</w:t>
+      </w:r>
+      <w:r>
+        <w:br/>
+      </w:r>
+      <w:r>
+        <w:br/>
+      </w:r>
+      <w:r>
+        <w:rPr>
+          <w:rStyle w:val="VerbatimChar"/>
+        </w:rPr>
+        <w:t xml:space="preserve">### Timeline</w:t>
+      </w:r>
+      <w:r>
+        <w:br/>
+      </w:r>
+      <w:r>
+        <w:rPr>
+          <w:rStyle w:val="VerbatimChar"/>
+        </w:rPr>
+        <w:t xml:space="preserve">- HH:MM — [event]</w:t>
+      </w:r>
+      <w:r>
+        <w:br/>
+      </w:r>
+      <w:r>
+        <w:rPr>
+          <w:rStyle w:val="VerbatimChar"/>
+        </w:rPr>
+        <w:t xml:space="preserve">- HH:MM — [action taken]</w:t>
+      </w:r>
+      <w:r>
+        <w:br/>
+      </w:r>
+      <w:r>
+        <w:rPr>
+          <w:rStyle w:val="VerbatimChar"/>
+        </w:rPr>
+        <w:t xml:space="preserve">- HH:MM — [resolution]</w:t>
+      </w:r>
+      <w:r>
+        <w:br/>
+      </w:r>
+      <w:r>
+        <w:br/>
+      </w:r>
+      <w:r>
+        <w:rPr>
+          <w:rStyle w:val="VerbatimChar"/>
+        </w:rPr>
+        <w:t xml:space="preserve">### Root Cause</w:t>
+      </w:r>
+      <w:r>
+        <w:br/>
+      </w:r>
+      <w:r>
+        <w:rPr>
+          <w:rStyle w:val="VerbatimChar"/>
+        </w:rPr>
+        <w:t xml:space="preserve">[Description of the root cause]</w:t>
+      </w:r>
+      <w:r>
+        <w:br/>
+      </w:r>
+      <w:r>
+        <w:br/>
+      </w:r>
+      <w:r>
+        <w:rPr>
+          <w:rStyle w:val="VerbatimChar"/>
+        </w:rPr>
+        <w:t xml:space="preserve">### Impact</w:t>
+      </w:r>
+      <w:r>
+        <w:br/>
+      </w:r>
+      <w:r>
+        <w:rPr>
+          <w:rStyle w:val="VerbatimChar"/>
+        </w:rPr>
+        <w:t xml:space="preserve">- Clinical impact: [none / delayed care / incorrect data displayed / ...]</w:t>
+      </w:r>
+      <w:r>
+        <w:br/>
+      </w:r>
+      <w:r>
+        <w:rPr>
+          <w:rStyle w:val="VerbatimChar"/>
+        </w:rPr>
+        <w:t xml:space="preserve">- Data impact: [none / data loss of X records / ...]</w:t>
+      </w:r>
+      <w:r>
+        <w:br/>
+      </w:r>
+      <w:r>
+        <w:rPr>
+          <w:rStyle w:val="VerbatimChar"/>
+        </w:rPr>
+        <w:t xml:space="preserve">- Financial impact: [none / delayed payments / ...]</w:t>
+      </w:r>
+      <w:r>
+        <w:br/>
+      </w:r>
+      <w:r>
+        <w:br/>
+      </w:r>
+      <w:r>
+        <w:rPr>
+          <w:rStyle w:val="VerbatimChar"/>
+        </w:rPr>
+        <w:t xml:space="preserve">### Corrective Actions</w:t>
+      </w:r>
+      <w:r>
+        <w:br/>
+      </w:r>
+      <w:r>
+        <w:rPr>
+          <w:rStyle w:val="VerbatimChar"/>
+        </w:rPr>
+        <w:t xml:space="preserve">1. [Action] — Owner: [name] — Due: [date]</w:t>
+      </w:r>
+      <w:r>
+        <w:br/>
+      </w:r>
+      <w:r>
+        <w:rPr>
+          <w:rStyle w:val="VerbatimChar"/>
+        </w:rPr>
+        <w:t xml:space="preserve">2. [Action] — Owner: [name] — Due: [date]</w:t>
+      </w:r>
+      <w:r>
+        <w:br/>
+      </w:r>
+      <w:r>
+        <w:br/>
+      </w:r>
+      <w:r>
+        <w:rPr>
+          <w:rStyle w:val="VerbatimChar"/>
+        </w:rPr>
+        <w:t xml:space="preserve">### Preventive Actions</w:t>
+      </w:r>
+      <w:r>
+        <w:br/>
+      </w:r>
+      <w:r>
+        <w:rPr>
+          <w:rStyle w:val="VerbatimChar"/>
+        </w:rPr>
+        <w:t xml:space="preserve">1. [Action to prevent recurrence] — Owner: [name] — Due: [date]</w:t>
+      </w:r>
+    </w:p>
     <w:bookmarkEnd w:id="58"/>
-    <w:bookmarkStart w:id="59" w:name="X13c0f92f9fc6056cb69829926e41a1073b3d5d4"/>
-    <w:p>
-      <w:pPr>
-        <w:pStyle w:val="Heading2"/>
-      </w:pPr>
-      <w:r>
-        <w:t xml:space="preserve">5. Post-Incident Review Template</w:t>
-      </w:r>
-    </w:p>
-    <w:p>
-      <w:pPr>
-        <w:pStyle w:val="FirstParagraph"/>
-      </w:pPr>
-      <w:r>
-        <w:t xml:space="preserve">Complete this template within 48 hours of resolving any Critical incident.</w:t>
-      </w:r>
-    </w:p>
-    <w:p>
-      <w:pPr>
-        <w:pStyle w:val="SourceCode"/>
-      </w:pPr>
-      <w:r>
-        <w:rPr>
-          <w:rStyle w:val="VerbatimChar"/>
-        </w:rPr>
-        <w:t xml:space="preserve">## Post-Incident Review</w:t>
-      </w:r>
-      <w:r>
-        <w:br/>
-      </w:r>
-      <w:r>
-        <w:br/>
-      </w:r>
-      <w:r>
-        <w:rPr>
-          <w:rStyle w:val="VerbatimChar"/>
-        </w:rPr>
-        <w:t xml:space="preserve">**Incident ID:** INC-YYYY-NNN</w:t>
-      </w:r>
-      <w:r>
-        <w:br/>
-      </w:r>
-      <w:r>
-        <w:rPr>
-          <w:rStyle w:val="VerbatimChar"/>
-        </w:rPr>
-        <w:t xml:space="preserve">**Date/Time Detected:** YYYY-MM-DD HH:MM EAT</w:t>
-      </w:r>
-      <w:r>
-        <w:br/>
-      </w:r>
-      <w:r>
-        <w:rPr>
-          <w:rStyle w:val="VerbatimChar"/>
-        </w:rPr>
-        <w:t xml:space="preserve">**Date/Time Resolved:** YYYY-MM-DD HH:MM EAT</w:t>
-      </w:r>
-      <w:r>
-        <w:br/>
-      </w:r>
-      <w:r>
-        <w:rPr>
-          <w:rStyle w:val="VerbatimChar"/>
-        </w:rPr>
-        <w:t xml:space="preserve">**Duration:** X hours Y minutes</w:t>
-      </w:r>
-      <w:r>
-        <w:br/>
-      </w:r>
-      <w:r>
-        <w:rPr>
-          <w:rStyle w:val="VerbatimChar"/>
-        </w:rPr>
-        <w:t xml:space="preserve">**Severity:** Critical / Warning</w:t>
-      </w:r>
-      <w:r>
-        <w:br/>
-      </w:r>
-      <w:r>
-        <w:rPr>
-          <w:rStyle w:val="VerbatimChar"/>
-        </w:rPr>
-        <w:t xml:space="preserve">**Affected Facilities:** [list]</w:t>
-      </w:r>
-      <w:r>
-        <w:br/>
-      </w:r>
-      <w:r>
-        <w:rPr>
-          <w:rStyle w:val="VerbatimChar"/>
-        </w:rPr>
-        <w:t xml:space="preserve">**Affected Patients:** [count, if applicable]</w:t>
-      </w:r>
-      <w:r>
-        <w:br/>
-      </w:r>
-      <w:r>
-        <w:br/>
-      </w:r>
-      <w:r>
-        <w:rPr>
-          <w:rStyle w:val="VerbatimChar"/>
-        </w:rPr>
-        <w:t xml:space="preserve">### Timeline</w:t>
-      </w:r>
-      <w:r>
-        <w:br/>
-      </w:r>
-      <w:r>
-        <w:rPr>
-          <w:rStyle w:val="VerbatimChar"/>
-        </w:rPr>
-        <w:t xml:space="preserve">- HH:MM — [event]</w:t>
-      </w:r>
-      <w:r>
-        <w:br/>
-      </w:r>
-      <w:r>
-        <w:rPr>
-          <w:rStyle w:val="VerbatimChar"/>
-        </w:rPr>
-        <w:t xml:space="preserve">- HH:MM — [action taken]</w:t>
-      </w:r>
-      <w:r>
-        <w:br/>
-      </w:r>
-      <w:r>
-        <w:rPr>
-          <w:rStyle w:val="VerbatimChar"/>
-        </w:rPr>
-        <w:t xml:space="preserve">- HH:MM — [resolution]</w:t>
-      </w:r>
-      <w:r>
-        <w:br/>
-      </w:r>
-      <w:r>
-        <w:br/>
-      </w:r>
-      <w:r>
-        <w:rPr>
-          <w:rStyle w:val="VerbatimChar"/>
-        </w:rPr>
-        <w:t xml:space="preserve">### Root Cause</w:t>
-      </w:r>
-      <w:r>
-        <w:br/>
-      </w:r>
-      <w:r>
-        <w:rPr>
-          <w:rStyle w:val="VerbatimChar"/>
-        </w:rPr>
-        <w:t xml:space="preserve">[Description of the root cause]</w:t>
-      </w:r>
-      <w:r>
-        <w:br/>
-      </w:r>
-      <w:r>
-        <w:br/>
-      </w:r>
-      <w:r>
-        <w:rPr>
-          <w:rStyle w:val="VerbatimChar"/>
-        </w:rPr>
-        <w:t xml:space="preserve">### Impact</w:t>
-      </w:r>
-      <w:r>
-        <w:br/>
-      </w:r>
-      <w:r>
-        <w:rPr>
-          <w:rStyle w:val="VerbatimChar"/>
-        </w:rPr>
-        <w:t xml:space="preserve">- Clinical impact: [none / delayed care / incorrect data displayed / ...]</w:t>
-      </w:r>
-      <w:r>
-        <w:br/>
-      </w:r>
-      <w:r>
-        <w:rPr>
-          <w:rStyle w:val="VerbatimChar"/>
-        </w:rPr>
-        <w:t xml:space="preserve">- Data impact: [none / data loss of X records / ...]</w:t>
-      </w:r>
-      <w:r>
-        <w:br/>
-      </w:r>
-      <w:r>
-        <w:rPr>
-          <w:rStyle w:val="VerbatimChar"/>
-        </w:rPr>
-        <w:t xml:space="preserve">- Financial impact: [none / delayed payments / ...]</w:t>
-      </w:r>
-      <w:r>
-        <w:br/>
-      </w:r>
-      <w:r>
-        <w:br/>
-      </w:r>
-      <w:r>
-        <w:rPr>
-          <w:rStyle w:val="VerbatimChar"/>
-        </w:rPr>
-        <w:t xml:space="preserve">### Corrective Actions</w:t>
-      </w:r>
-      <w:r>
-        <w:br/>
-      </w:r>
-      <w:r>
-        <w:rPr>
-          <w:rStyle w:val="VerbatimChar"/>
-        </w:rPr>
-        <w:t xml:space="preserve">1. [Action] — Owner: [name] — Due: [date]</w:t>
-      </w:r>
-      <w:r>
-        <w:br/>
-      </w:r>
-      <w:r>
-        <w:rPr>
-          <w:rStyle w:val="VerbatimChar"/>
-        </w:rPr>
-        <w:t xml:space="preserve">2. [Action] — Owner: [name] — Due: [date]</w:t>
-      </w:r>
-      <w:r>
-        <w:br/>
-      </w:r>
-      <w:r>
-        <w:br/>
-      </w:r>
-      <w:r>
-        <w:rPr>
-          <w:rStyle w:val="VerbatimChar"/>
-        </w:rPr>
-        <w:t xml:space="preserve">### Preventive Actions</w:t>
-      </w:r>
-      <w:r>
-        <w:br/>
-      </w:r>
-      <w:r>
-        <w:rPr>
-          <w:rStyle w:val="VerbatimChar"/>
-        </w:rPr>
-        <w:t xml:space="preserve">1. [Action to prevent recurrence] — Owner: [name] — Due: [date]</w:t>
-      </w:r>
-    </w:p>
     <w:bookmarkEnd w:id="59"/>
-    <w:bookmarkEnd w:id="60"/>
     <w:sectPr>
       <w:footerReference r:id="rId9" w:type="default"/>
       <w:headerReference r:id="rId10" w:type="default"/>

</xml_diff>